<commit_message>
Implement hospital management features and enhance template handling
</commit_message>
<xml_diff>
--- a/public/templates/BID FORM 1.docx
+++ b/public/templates/BID FORM 1.docx
@@ -342,7 +342,70 @@
           <w:sz w:val="24"/>
           <w:szCs w:val="24"/>
         </w:rPr>
-        <w:t>{{date}}</w:t>
+        <w:t>{{</w:t>
+      </w:r>
+      <w:proofErr w:type="spellStart"/>
+      <w:r>
+        <w:rPr>
+          <w:rFonts w:ascii="Candara" w:eastAsia="Times New Roman" w:hAnsi="Candara" w:cs="Times New Roman"/>
+          <w:sz w:val="24"/>
+          <w:szCs w:val="24"/>
+        </w:rPr>
+        <w:t>date</w:t>
+      </w:r>
+      <w:r>
+        <w:rPr>
+          <w:rFonts w:ascii="Candara" w:eastAsia="Times New Roman" w:hAnsi="Candara" w:cs="Times New Roman"/>
+          <w:sz w:val="24"/>
+          <w:szCs w:val="24"/>
+        </w:rPr>
+        <w:t>Day</w:t>
+      </w:r>
+      <w:proofErr w:type="spellEnd"/>
+      <w:r>
+        <w:rPr>
+          <w:rFonts w:ascii="Candara" w:eastAsia="Times New Roman" w:hAnsi="Candara" w:cs="Times New Roman"/>
+          <w:sz w:val="24"/>
+          <w:szCs w:val="24"/>
+        </w:rPr>
+        <w:t>}}</w:t>
+      </w:r>
+      <w:r>
+        <w:rPr>
+          <w:rFonts w:ascii="Candara" w:eastAsia="Times New Roman" w:hAnsi="Candara" w:cs="Times New Roman"/>
+          <w:sz w:val="24"/>
+          <w:szCs w:val="24"/>
+          <w:vertAlign w:val="superscript"/>
+        </w:rPr>
+        <w:t>{{</w:t>
+      </w:r>
+      <w:proofErr w:type="spellStart"/>
+      <w:r>
+        <w:rPr>
+          <w:rFonts w:ascii="Candara" w:eastAsia="Times New Roman" w:hAnsi="Candara" w:cs="Times New Roman"/>
+          <w:sz w:val="24"/>
+          <w:szCs w:val="24"/>
+          <w:vertAlign w:val="superscript"/>
+        </w:rPr>
+        <w:t>daySuffix</w:t>
+      </w:r>
+      <w:proofErr w:type="spellEnd"/>
+      <w:r>
+        <w:rPr>
+          <w:rFonts w:ascii="Candara" w:eastAsia="Times New Roman" w:hAnsi="Candara" w:cs="Times New Roman"/>
+          <w:sz w:val="24"/>
+          <w:szCs w:val="24"/>
+          <w:vertAlign w:val="superscript"/>
+        </w:rPr>
+        <w:t>}}</w:t>
+      </w:r>
+      <w:r>
+        <w:rPr>
+          <w:rFonts w:ascii="Candara" w:eastAsia="Times New Roman" w:hAnsi="Candara" w:cs="Times New Roman"/>
+          <w:sz w:val="24"/>
+          <w:szCs w:val="24"/>
+        </w:rPr>
+        <w:t xml:space="preserve"> {{dateMonth}}, {{dateYear}}</w:t>
       </w:r>
       <w:r>
         <w:rPr>
@@ -412,7 +475,7 @@
           <w:szCs w:val="26"/>
           <w:lang w:val="en-ZA"/>
         </w:rPr>
-        <w:t xml:space="preserve"> </w:t>
+        <w:t xml:space="preserve">SQ, NO.: </w:t>
       </w:r>
       <w:r>
         <w:rPr>
@@ -422,24 +485,6 @@
           <w:sz w:val="26"/>
           <w:szCs w:val="26"/>
           <w:lang w:val="en-ZA"/>
-        </w:rPr>
-        <w:t xml:space="preserve">  </w:t>
-      </w:r>
-      <w:r>
-        <w:rPr>
-          <w:rFonts w:ascii="Candara" w:hAnsi="Candara"/>
-          <w:b/>
-          <w:bCs/>
-          <w:sz w:val="26"/>
-          <w:szCs w:val="26"/>
-          <w:lang w:val="en-ZA"/>
-        </w:rPr>
-        <w:t xml:space="preserve">SQ, NO.: </w:t>
-      </w:r>
-      <w:r>
-        <w:rPr>
-          <w:b/>
-          <w:bCs/>
         </w:rPr>
         <w:t>{{sqNumber}}</w:t>
       </w:r>
@@ -528,7 +573,27 @@
           <w:sz w:val="26"/>
           <w:szCs w:val="26"/>
         </w:rPr>
-        <w:t>{{hospitalAddress}}</w:t>
+        <w:t>{{</w:t>
+      </w:r>
+      <w:proofErr w:type="spellStart"/>
+      <w:r>
+        <w:rPr>
+          <w:rFonts w:ascii="Candara" w:hAnsi="Candara"/>
+          <w:b/>
+          <w:sz w:val="26"/>
+          <w:szCs w:val="26"/>
+        </w:rPr>
+        <w:t>hospitalAddress</w:t>
+      </w:r>
+      <w:proofErr w:type="spellEnd"/>
+      <w:r>
+        <w:rPr>
+          <w:rFonts w:ascii="Candara" w:hAnsi="Candara"/>
+          <w:b/>
+          <w:sz w:val="26"/>
+          <w:szCs w:val="26"/>
+        </w:rPr>
+        <w:t>}}</w:t>
       </w:r>
     </w:p>
     <w:p>
@@ -597,7 +662,37 @@
           <w:szCs w:val="25"/>
           <w:u w:val="single"/>
         </w:rPr>
-        <w:t>{{tenderTitle}}</w:t>
+        <w:t>{{t</w:t>
+      </w:r>
+      <w:r>
+        <w:rPr>
+          <w:rFonts w:ascii="Candara" w:eastAsia="Times New Roman" w:hAnsi="Candara" w:cs="Arial"/>
+          <w:b/>
+          <w:sz w:val="25"/>
+          <w:szCs w:val="25"/>
+          <w:u w:val="single"/>
+        </w:rPr>
+        <w:t>itle</w:t>
+      </w:r>
+      <w:r>
+        <w:rPr>
+          <w:rFonts w:ascii="Candara" w:eastAsia="Times New Roman" w:hAnsi="Candara" w:cs="Arial"/>
+          <w:b/>
+          <w:sz w:val="25"/>
+          <w:szCs w:val="25"/>
+          <w:u w:val="single"/>
+        </w:rPr>
+        <w:t>Upper</w:t>
+      </w:r>
+      <w:r>
+        <w:rPr>
+          <w:rFonts w:ascii="Candara" w:eastAsia="Times New Roman" w:hAnsi="Candara" w:cs="Arial"/>
+          <w:b/>
+          <w:sz w:val="25"/>
+          <w:szCs w:val="25"/>
+          <w:u w:val="single"/>
+        </w:rPr>
+        <w:t>}}</w:t>
       </w:r>
     </w:p>
     <w:p>
@@ -653,19 +748,17 @@
           <w:sz w:val="25"/>
           <w:szCs w:val="25"/>
         </w:rPr>
-        <w:t>{{</w:t>
-      </w:r>
-      <w:proofErr w:type="spellStart"/>
-      <w:r>
-        <w:rPr>
-          <w:rFonts w:ascii="Candara" w:eastAsia="Times New Roman" w:hAnsi="Candara" w:cs="Arial"/>
-          <w:b/>
-          <w:sz w:val="25"/>
-          <w:szCs w:val="25"/>
-        </w:rPr>
-        <w:t>tenderTitle</w:t>
-      </w:r>
-      <w:proofErr w:type="spellEnd"/>
+        <w:t>{{t</w:t>
+      </w:r>
+      <w:r>
+        <w:rPr>
+          <w:rFonts w:ascii="Candara" w:eastAsia="Times New Roman" w:hAnsi="Candara" w:cs="Arial"/>
+          <w:b/>
+          <w:sz w:val="25"/>
+          <w:szCs w:val="25"/>
+        </w:rPr>
+        <w:t>itleTitle</w:t>
+      </w:r>
       <w:r>
         <w:rPr>
           <w:rFonts w:ascii="Candara" w:eastAsia="Times New Roman" w:hAnsi="Candara" w:cs="Arial"/>
@@ -1295,7 +1388,7 @@
             </wp:anchor>
           </w:drawing>
         </mc:Choice>
-        <mc:Fallback xmlns:w16du="http://schemas.microsoft.com/office/word/2023/wordml/word16du" xmlns:w16sdtfl="http://schemas.microsoft.com/office/word/2024/wordml/sdtformatlock">
+        <mc:Fallback xmlns:w16sdtfl="http://schemas.microsoft.com/office/word/2024/wordml/sdtformatlock" xmlns:w16du="http://schemas.microsoft.com/office/word/2023/wordml/word16du">
           <w:pict>
             <v:line w14:anchorId="72932E7E" id="Straight Connector 3" o:spid="_x0000_s1026" style="position:absolute;z-index:251666432;visibility:visible;mso-wrap-style:square;mso-width-percent:0;mso-height-percent:0;mso-wrap-distance-left:9pt;mso-wrap-distance-top:0;mso-wrap-distance-right:9pt;mso-wrap-distance-bottom:0;mso-position-horizontal:absolute;mso-position-horizontal-relative:text;mso-position-vertical:absolute;mso-position-vertical-relative:text;mso-width-percent:0;mso-height-percent:0;mso-width-relative:margin;mso-height-relative:margin" from="-21.85pt,.15pt" to="531.75pt,.15pt" o:gfxdata="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" strokecolor="#4579b8 [3044]"/>
           </w:pict>
@@ -2261,7 +2354,7 @@
             </wp:anchor>
           </w:drawing>
         </mc:Choice>
-        <mc:Fallback xmlns:w16du="http://schemas.microsoft.com/office/word/2023/wordml/word16du" xmlns:w16sdtfl="http://schemas.microsoft.com/office/word/2024/wordml/sdtformatlock">
+        <mc:Fallback xmlns:w16sdtfl="http://schemas.microsoft.com/office/word/2024/wordml/sdtformatlock" xmlns:w16du="http://schemas.microsoft.com/office/word/2023/wordml/word16du">
           <w:pict>
             <v:line w14:anchorId="557298B3" id="Straight Connector 27" o:spid="_x0000_s1026" style="position:absolute;z-index:251662336;visibility:visible;mso-wrap-style:square;mso-width-percent:0;mso-height-percent:0;mso-wrap-distance-left:9pt;mso-wrap-distance-top:0;mso-wrap-distance-right:9pt;mso-wrap-distance-bottom:0;mso-position-horizontal:absolute;mso-position-horizontal-relative:text;mso-position-vertical:absolute;mso-position-vertical-relative:text;mso-width-percent:0;mso-height-percent:0;mso-width-relative:margin;mso-height-relative:margin" from="34.6pt,36.8pt" to="529.7pt,38.6pt" o:gfxdata="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" strokecolor="#4579b8 [3044]"/>
           </w:pict>

</xml_diff>